<commit_message>
feat(dossiers): « diligence particulière », « Instance », responsabilité civile
</commit_message>
<xml_diff>
--- a/Doc/Final_Contract_API-AUDIENCES_ET_DELIBERES_V1.1.docx
+++ b/Doc/Final_Contract_API-AUDIENCES_ET_DELIBERES_V1.1.docx
@@ -3720,7 +3720,7 @@
               </w:rPr>
             </w:pPr>
             <w:r>
-              <w:t xml:space="preserve">Statuer sur la sensibilité proposée (DJ, DJA).</w:t>
+              <w:t>Statuer sur la diligence particulière proposée (DJ, DJA).</w:t>
             </w:r>
           </w:p>
         </w:tc>
@@ -7103,7 +7103,7 @@
               </w:rPr>
             </w:pPr>
             <w:r>
-              <w:t xml:space="preserve">Types de client sensible admis.</w:t>
+              <w:t>Types de client admis.</w:t>
             </w:r>
           </w:p>
         </w:tc>
@@ -20148,7 +20148,7 @@
           <w:szCs w:val="16"/>
           <w:lang w:val="en-US"/>
         </w:rPr>
-        <w:t xml:space="preserve">      summary: Statuer sur la sensibilité proposée (DJ, DJA).</w:t>
+        <w:t xml:space="preserve">      summary: Statuer sur la diligence particulière proposée (DJ, DJA).</w:t>
       </w:r>
     </w:p>
     <w:p>
@@ -27496,7 +27496,7 @@
           <w:szCs w:val="16"/>
           <w:lang w:val="en-US"/>
         </w:rPr>
-        <w:t xml:space="preserve">      summary: Types de client sensible admis.</w:t>
+        <w:t xml:space="preserve">      summary: Types de client admis.</w:t>
       </w:r>
     </w:p>
     <w:p>

</xml_diff>